<commit_message>
add Persona 2, 3 into the file
</commit_message>
<xml_diff>
--- a/Culture Exchange Website.docx
+++ b/Culture Exchange Website.docx
@@ -17,18 +17,17 @@
           <w:sz w:val="56"/>
           <w:szCs w:val="56"/>
         </w:rPr>
-        <w:t>QQQ</w:t>
-      </w:r>
-      <w:bookmarkStart w:id="0" w:name="_GoBack"/>
-      <w:bookmarkEnd w:id="0"/>
-      <w:r>
-        <w:rPr>
-          <w:b/>
+        <w:t>Capstone – COMP3059 Sprint 1</w:t>
+      </w:r>
+    </w:p>
+    <w:p>
+      <w:pPr>
+        <w:jc w:val="center"/>
+        <w:rPr>
           <w:sz w:val="56"/>
           <w:szCs w:val="56"/>
         </w:rPr>
-        <w:t>Capstone – COMP3059 Sprint 1</w:t>
-      </w:r>
+      </w:pPr>
     </w:p>
     <w:p>
       <w:pPr>
@@ -38,30 +37,21 @@
           <w:szCs w:val="56"/>
         </w:rPr>
       </w:pPr>
-    </w:p>
-    <w:p>
-      <w:pPr>
-        <w:jc w:val="center"/>
+      <w:r>
         <w:rPr>
           <w:sz w:val="56"/>
           <w:szCs w:val="56"/>
         </w:rPr>
-      </w:pPr>
-      <w:r>
+        <w:t>Culture Exchange Website</w:t>
+      </w:r>
+    </w:p>
+    <w:p>
+      <w:pPr>
+        <w:jc w:val="center"/>
         <w:rPr>
           <w:sz w:val="56"/>
           <w:szCs w:val="56"/>
         </w:rPr>
-        <w:t>Culture Exchange Website</w:t>
-      </w:r>
-    </w:p>
-    <w:p>
-      <w:pPr>
-        <w:jc w:val="center"/>
-        <w:rPr>
-          <w:sz w:val="56"/>
-          <w:szCs w:val="56"/>
-        </w:rPr>
       </w:pPr>
     </w:p>
     <w:p>
@@ -436,8 +426,8 @@
           <w:szCs w:val="24"/>
         </w:rPr>
       </w:pPr>
-      <w:bookmarkStart w:id="1" w:name="OLE_LINK2"/>
-      <w:bookmarkStart w:id="2" w:name="OLE_LINK3"/>
+      <w:bookmarkStart w:id="0" w:name="OLE_LINK2"/>
+      <w:bookmarkStart w:id="1" w:name="OLE_LINK3"/>
       <w:r>
         <w:rPr>
           <w:b/>
@@ -447,60 +437,60 @@
         <w:t>Scenarios:</w:t>
       </w:r>
     </w:p>
+    <w:bookmarkEnd w:id="0"/>
     <w:bookmarkEnd w:id="1"/>
+    <w:p>
+      <w:pPr>
+        <w:rPr>
+          <w:b/>
+          <w:sz w:val="24"/>
+          <w:szCs w:val="24"/>
+        </w:rPr>
+      </w:pPr>
+      <w:r>
+        <w:rPr>
+          <w:b/>
+          <w:sz w:val="24"/>
+          <w:szCs w:val="24"/>
+        </w:rPr>
+        <w:t>Users:</w:t>
+      </w:r>
+    </w:p>
+    <w:p>
+      <w:pPr>
+        <w:rPr>
+          <w:sz w:val="24"/>
+          <w:szCs w:val="24"/>
+        </w:rPr>
+      </w:pPr>
+      <w:bookmarkStart w:id="2" w:name="OLE_LINK4"/>
+      <w:bookmarkStart w:id="3" w:name="OLE_LINK5"/>
+      <w:r>
+        <w:rPr>
+          <w:sz w:val="24"/>
+          <w:szCs w:val="24"/>
+        </w:rPr>
+        <w:tab/>
+      </w:r>
+      <w:proofErr w:type="gramStart"/>
+      <w:r>
+        <w:rPr>
+          <w:sz w:val="24"/>
+          <w:szCs w:val="24"/>
+        </w:rPr>
+        <w:t>Has the ability to</w:t>
+      </w:r>
+      <w:proofErr w:type="gramEnd"/>
+      <w:r>
+        <w:rPr>
+          <w:sz w:val="24"/>
+          <w:szCs w:val="24"/>
+        </w:rPr>
+        <w:t xml:space="preserve"> log in and access their accounts online. The online personal profile is to provide personal information, the culture or language that they interested in, and their personal event calendar. Can change certain personal information such as address, phone number etc. Want to be able to view other’s comment in culture forum as well as leave theirs. Can launch a social event based on the culture exchange topic such as Festivals, local food tasting and table conversation.   </w:t>
+      </w:r>
+    </w:p>
     <w:bookmarkEnd w:id="2"/>
-    <w:p>
-      <w:pPr>
-        <w:rPr>
-          <w:b/>
-          <w:sz w:val="24"/>
-          <w:szCs w:val="24"/>
-        </w:rPr>
-      </w:pPr>
-      <w:r>
-        <w:rPr>
-          <w:b/>
-          <w:sz w:val="24"/>
-          <w:szCs w:val="24"/>
-        </w:rPr>
-        <w:t>Users:</w:t>
-      </w:r>
-    </w:p>
-    <w:p>
-      <w:pPr>
-        <w:rPr>
-          <w:sz w:val="24"/>
-          <w:szCs w:val="24"/>
-        </w:rPr>
-      </w:pPr>
-      <w:bookmarkStart w:id="3" w:name="OLE_LINK4"/>
-      <w:bookmarkStart w:id="4" w:name="OLE_LINK5"/>
-      <w:r>
-        <w:rPr>
-          <w:sz w:val="24"/>
-          <w:szCs w:val="24"/>
-        </w:rPr>
-        <w:tab/>
-      </w:r>
-      <w:proofErr w:type="gramStart"/>
-      <w:r>
-        <w:rPr>
-          <w:sz w:val="24"/>
-          <w:szCs w:val="24"/>
-        </w:rPr>
-        <w:t>Has the ability to</w:t>
-      </w:r>
-      <w:proofErr w:type="gramEnd"/>
-      <w:r>
-        <w:rPr>
-          <w:sz w:val="24"/>
-          <w:szCs w:val="24"/>
-        </w:rPr>
-        <w:t xml:space="preserve"> log in and access their accounts online. The online personal profile is to provide personal information, the culture or language that they interested in, and their personal event calendar. Can change certain personal information such as address, phone number etc. Want to be able to view other’s comment in culture forum as well as leave theirs. Can launch a social event based on the culture exchange topic such as Festivals, local food tasting and table conversation.   </w:t>
-      </w:r>
-    </w:p>
     <w:bookmarkEnd w:id="3"/>
-    <w:bookmarkEnd w:id="4"/>
     <w:p>
       <w:pPr>
         <w:rPr>
@@ -745,7 +735,7 @@
         </w:rPr>
         <w:t xml:space="preserve">As a user, I </w:t>
       </w:r>
-      <w:bookmarkStart w:id="5" w:name="OLE_LINK1"/>
+      <w:bookmarkStart w:id="4" w:name="OLE_LINK1"/>
       <w:r>
         <w:rPr>
           <w:sz w:val="24"/>
@@ -754,7 +744,7 @@
         </w:rPr>
         <w:t xml:space="preserve">would </w:t>
       </w:r>
-      <w:bookmarkEnd w:id="5"/>
+      <w:bookmarkEnd w:id="4"/>
       <w:r>
         <w:rPr>
           <w:sz w:val="24"/>
@@ -840,6 +830,307 @@
     <w:p>
       <w:pPr>
         <w:rPr>
+          <w:b/>
+          <w:sz w:val="24"/>
+        </w:rPr>
+      </w:pPr>
+      <w:r>
+        <w:rPr>
+          <w:b/>
+          <w:sz w:val="24"/>
+        </w:rPr>
+        <w:lastRenderedPageBreak/>
+        <w:t>Sam Smith</w:t>
+      </w:r>
+      <w:r>
+        <w:rPr>
+          <w:b/>
+          <w:sz w:val="24"/>
+        </w:rPr>
+        <w:t xml:space="preserve"> (User)</w:t>
+      </w:r>
+    </w:p>
+    <w:p>
+      <w:pPr>
+        <w:rPr>
+          <w:b/>
+          <w:sz w:val="24"/>
+        </w:rPr>
+      </w:pPr>
+    </w:p>
+    <w:p>
+      <w:pPr>
+        <w:rPr>
+          <w:sz w:val="24"/>
+        </w:rPr>
+      </w:pPr>
+      <w:r>
+        <w:rPr>
+          <w:sz w:val="24"/>
+        </w:rPr>
+        <w:t>Sam Smith</w:t>
+      </w:r>
+      <w:r>
+        <w:rPr>
+          <w:sz w:val="24"/>
+        </w:rPr>
+        <w:t xml:space="preserve"> is a </w:t>
+      </w:r>
+      <w:proofErr w:type="gramStart"/>
+      <w:r>
+        <w:rPr>
+          <w:sz w:val="24"/>
+        </w:rPr>
+        <w:t>17 year old</w:t>
+      </w:r>
+      <w:proofErr w:type="gramEnd"/>
+      <w:r>
+        <w:rPr>
+          <w:sz w:val="24"/>
+        </w:rPr>
+        <w:t xml:space="preserve"> high school student majoring in geography and minoring in history. His family is from </w:t>
+      </w:r>
+      <w:proofErr w:type="gramStart"/>
+      <w:r>
+        <w:rPr>
+          <w:sz w:val="24"/>
+        </w:rPr>
+        <w:t>Michigan</w:t>
+      </w:r>
+      <w:proofErr w:type="gramEnd"/>
+      <w:r>
+        <w:rPr>
+          <w:sz w:val="24"/>
+        </w:rPr>
+        <w:t xml:space="preserve"> but they moved to Toronto, Ontario due to his father’s work in real estate. Sam has a younger brother who enjoys dance and his mother is a yoga teacher who encourages him to pursue what he loves.</w:t>
+      </w:r>
+    </w:p>
+    <w:p>
+      <w:pPr>
+        <w:rPr>
+          <w:sz w:val="24"/>
+        </w:rPr>
+      </w:pPr>
+      <w:r>
+        <w:rPr>
+          <w:sz w:val="24"/>
+        </w:rPr>
+        <w:t>Sam was recently assigned a project in his history class to research a country’s culture and create a PowerPoint based on the selected country’s heritage, religion, food and fashion. Seeing as Sam is already from a more western part of the world, he decides to do his project on China.</w:t>
+      </w:r>
+    </w:p>
+    <w:p>
+      <w:pPr>
+        <w:rPr>
+          <w:sz w:val="24"/>
+        </w:rPr>
+      </w:pPr>
+      <w:proofErr w:type="gramStart"/>
+      <w:r>
+        <w:rPr>
+          <w:sz w:val="24"/>
+        </w:rPr>
+        <w:t>In order to</w:t>
+      </w:r>
+      <w:proofErr w:type="gramEnd"/>
+      <w:r>
+        <w:rPr>
+          <w:sz w:val="24"/>
+        </w:rPr>
+        <w:t xml:space="preserve"> receive the most accurate information about the country and to avoid any forms of plagiarism, Sam uses </w:t>
+      </w:r>
+      <w:proofErr w:type="spellStart"/>
+      <w:r>
+        <w:rPr>
+          <w:sz w:val="24"/>
+        </w:rPr>
+        <w:t>CultureConnect</w:t>
+      </w:r>
+      <w:proofErr w:type="spellEnd"/>
+      <w:r>
+        <w:rPr>
+          <w:sz w:val="24"/>
+        </w:rPr>
+        <w:t xml:space="preserve"> to learn about gatherings and any festivals around Toronto that both practice and celebrate the Chinese culture. This way he can meet with others and conduct interviews to gather accurate research on a part of the world he has never visited before.</w:t>
+      </w:r>
+    </w:p>
+    <w:p>
+      <w:pPr>
+        <w:rPr>
+          <w:sz w:val="24"/>
+        </w:rPr>
+      </w:pPr>
+    </w:p>
+    <w:p>
+      <w:pPr>
+        <w:rPr>
+          <w:b/>
+          <w:sz w:val="24"/>
+        </w:rPr>
+      </w:pPr>
+      <w:r>
+        <w:rPr>
+          <w:b/>
+          <w:sz w:val="24"/>
+        </w:rPr>
+        <w:t>User Stories</w:t>
+      </w:r>
+    </w:p>
+    <w:p>
+      <w:pPr>
+        <w:rPr>
+          <w:sz w:val="24"/>
+        </w:rPr>
+      </w:pPr>
+      <w:r>
+        <w:rPr>
+          <w:sz w:val="24"/>
+        </w:rPr>
+        <w:t>As a user, I want to have current event information based on the country I have selected.</w:t>
+      </w:r>
+    </w:p>
+    <w:p>
+      <w:pPr>
+        <w:rPr>
+          <w:sz w:val="24"/>
+        </w:rPr>
+      </w:pPr>
+      <w:r>
+        <w:rPr>
+          <w:sz w:val="24"/>
+        </w:rPr>
+        <w:t>As a user, I want to be able to experience a countries heritage first hand.</w:t>
+      </w:r>
+    </w:p>
+    <w:p>
+      <w:pPr>
+        <w:rPr>
+          <w:i/>
+          <w:sz w:val="24"/>
+        </w:rPr>
+      </w:pPr>
+      <w:r>
+        <w:rPr>
+          <w:sz w:val="24"/>
+        </w:rPr>
+        <w:t>As a user, I want to be able to communicate freely with different people from around the world.</w:t>
+      </w:r>
+    </w:p>
+    <w:p>
+      <w:pPr>
+        <w:rPr>
+          <w:sz w:val="24"/>
+          <w:szCs w:val="24"/>
+          <w:lang w:eastAsia="zh-CN"/>
+        </w:rPr>
+      </w:pPr>
+    </w:p>
+    <w:p>
+      <w:pPr>
+        <w:rPr>
+          <w:b/>
+          <w:sz w:val="24"/>
+          <w:szCs w:val="24"/>
+          <w:lang w:eastAsia="zh-CN"/>
+        </w:rPr>
+      </w:pPr>
+      <w:r>
+        <w:rPr>
+          <w:b/>
+          <w:sz w:val="24"/>
+          <w:szCs w:val="24"/>
+        </w:rPr>
+        <w:t>Tung Nguyen</w:t>
+      </w:r>
+      <w:r>
+        <w:rPr>
+          <w:b/>
+          <w:sz w:val="24"/>
+          <w:szCs w:val="24"/>
+        </w:rPr>
+        <w:t xml:space="preserve"> (User)</w:t>
+      </w:r>
+    </w:p>
+    <w:p>
+      <w:pPr>
+        <w:rPr>
+          <w:b/>
+          <w:sz w:val="24"/>
+          <w:szCs w:val="24"/>
+        </w:rPr>
+      </w:pPr>
+      <w:r>
+        <w:rPr>
+          <w:sz w:val="24"/>
+          <w:szCs w:val="24"/>
+        </w:rPr>
+        <w:t xml:space="preserve">Tung Nguyen is a </w:t>
+      </w:r>
+      <w:proofErr w:type="gramStart"/>
+      <w:r>
+        <w:rPr>
+          <w:sz w:val="24"/>
+          <w:szCs w:val="24"/>
+        </w:rPr>
+        <w:t>20 year-old</w:t>
+      </w:r>
+      <w:proofErr w:type="gramEnd"/>
+      <w:r>
+        <w:rPr>
+          <w:sz w:val="24"/>
+          <w:szCs w:val="24"/>
+        </w:rPr>
+        <w:t xml:space="preserve"> international student. He's from Vietnam. He comes to Canada alone and has no relatives or any relationship. He studies business administration at GBC. His study requires lots of communication and understanding about the business environment where he lives includes customer, ethics, manners and etiquette. With a diverse of multiple culture in Canada, he'd like to join culture events and festivals so that he can understand the customer specifically.  Besides, he wants to be a part of the Canadian community and work well with people surrounding. </w:t>
+      </w:r>
+    </w:p>
+    <w:p>
+      <w:pPr>
+        <w:rPr>
+          <w:sz w:val="24"/>
+          <w:szCs w:val="24"/>
+        </w:rPr>
+      </w:pPr>
+      <w:r>
+        <w:rPr>
+          <w:b/>
+          <w:sz w:val="24"/>
+          <w:szCs w:val="24"/>
+        </w:rPr>
+        <w:t>User stories</w:t>
+      </w:r>
+    </w:p>
+    <w:p>
+      <w:pPr>
+        <w:rPr>
+          <w:sz w:val="24"/>
+          <w:szCs w:val="24"/>
+        </w:rPr>
+      </w:pPr>
+      <w:r>
+        <w:rPr>
+          <w:sz w:val="24"/>
+          <w:szCs w:val="24"/>
+        </w:rPr>
+        <w:t>As a user, I want to have tracking event location so that I can locate any events near me.</w:t>
+      </w:r>
+    </w:p>
+    <w:p>
+      <w:pPr>
+        <w:rPr>
+          <w:sz w:val="24"/>
+          <w:szCs w:val="24"/>
+        </w:rPr>
+      </w:pPr>
+      <w:r>
+        <w:rPr>
+          <w:sz w:val="24"/>
+          <w:szCs w:val="24"/>
+        </w:rPr>
+        <w:t>As a user, I want to have a filter feature so that I can choose specific cultures I like.</w:t>
+      </w:r>
+    </w:p>
+    <w:p>
+      <w:pPr>
+        <w:rPr>
           <w:lang w:eastAsia="zh-CN"/>
         </w:rPr>
       </w:pPr>
@@ -1216,7 +1507,10 @@
     <w:p/>
     <w:p/>
     <w:p/>
-    <w:p/>
+    <w:p>
+      <w:bookmarkStart w:id="5" w:name="_GoBack"/>
+      <w:bookmarkEnd w:id="5"/>
+    </w:p>
     <w:p/>
     <w:p>
       <w:pPr>

</xml_diff>